<commit_message>
Fix Jenkins frontend checkout and deployment
</commit_message>
<xml_diff>
--- a/Final_Project_Creation-study-tracker.docx
+++ b/Final_Project_Creation-study-tracker.docx
@@ -3785,6 +3785,7 @@
         <w:t>)</w:t>
       </w:r>
     </w:p>
+    <w:p/>
     <w:p>
       <w:r>
         <w:t xml:space="preserve"> </w:t>
@@ -3877,6 +3878,7 @@
         </w:pBdr>
       </w:pPr>
       <w:r>
+        <w:lastRenderedPageBreak/>
         <w:t>OK</w:t>
       </w:r>
       <w:r>
@@ -3894,7 +3896,6 @@
     </w:p>
     <w:p>
       <w:r>
-        <w:lastRenderedPageBreak/>
         <w:t>Choose</w:t>
       </w:r>
     </w:p>
@@ -4094,6 +4095,7 @@
         <w:rPr>
           <w:noProof/>
         </w:rPr>
+        <w:lastRenderedPageBreak/>
         <w:drawing>
           <wp:inline distT="0" distB="0" distL="0" distR="0" wp14:anchorId="5A5BAA2B" wp14:editId="46A6A562">
             <wp:extent cx="5731510" cy="972820"/>
@@ -4155,7 +4157,6 @@
     </w:p>
     <w:p>
       <w:r>
-        <w:lastRenderedPageBreak/>
         <w:t>cd "C:\Users\akhil\OneDrive\Desktop\Home\My_Project Creation\working-track\working-track\working-track"</w:t>
       </w:r>
     </w:p>
@@ -4308,6 +4309,7 @@
     </w:p>
     <w:p>
       <w:r>
+        <w:lastRenderedPageBreak/>
         <w:t>ports:</w:t>
       </w:r>
     </w:p>
@@ -4324,7 +4326,6 @@
     </w:p>
     <w:p>
       <w:r>
-        <w:lastRenderedPageBreak/>
         <w:t>Then:</w:t>
       </w:r>
     </w:p>
@@ -4572,6 +4573,7 @@
         </w:pBdr>
       </w:pPr>
       <w:r>
+        <w:lastRenderedPageBreak/>
         <w:t>ecb92d073b46   mysql:8.0                           "docker-entrypoint.s…"   About a minute ago   Up About a minute (healthy)   0.0.0.0:3307-&gt;3306/tcp, [::]:3307-&gt;3306/tcp   workingtrack-mysql</w:t>
       </w:r>
     </w:p>
@@ -4598,7 +4600,6 @@
         </w:pBdr>
       </w:pPr>
       <w:r>
-        <w:lastRenderedPageBreak/>
         <w:t>55453893385f   mysql:8.0                           "docker-entrypoint.s…"   3 days ago           Up 16 hours                   3306/tcp                                      learningtrack-mysql</w:t>
       </w:r>
     </w:p>
@@ -4837,6 +4838,7 @@
     </w:p>
     <w:p>
       <w:r>
+        <w:lastRenderedPageBreak/>
         <w:t>Settings</w:t>
       </w:r>
     </w:p>
@@ -4857,7 +4859,6 @@
     </w:p>
     <w:p>
       <w:r>
-        <w:lastRenderedPageBreak/>
         <w:t>Add Webhook</w:t>
       </w:r>
     </w:p>
@@ -5043,6 +5044,7 @@
           <w:b/>
           <w:bCs/>
         </w:rPr>
+        <w:lastRenderedPageBreak/>
         <w:t>🚀</w:t>
       </w:r>
       <w:r>
@@ -5070,7 +5072,6 @@
     </w:p>
     <w:p>
       <w:r>
-        <w:lastRenderedPageBreak/>
         <w:t>node_modules</w:t>
       </w:r>
     </w:p>
@@ -5382,6 +5383,7 @@
     </w:p>
     <w:p>
       <w:r>
+        <w:lastRenderedPageBreak/>
         <w:t>↓</w:t>
       </w:r>
     </w:p>
@@ -5394,7 +5396,6 @@
     <w:p/>
     <w:p>
       <w:r>
-        <w:lastRenderedPageBreak/>
         <w:t>↓</w:t>
       </w:r>
     </w:p>
@@ -5671,6 +5672,7 @@
     </w:p>
     <w:p>
       <w:r>
+        <w:lastRenderedPageBreak/>
         <w:t>docker run -d -p 4200:80 --name learning-track-ui learning-track-ui</w:t>
       </w:r>
     </w:p>
@@ -5691,7 +5693,6 @@
     </w:p>
     <w:p>
       <w:r>
-        <w:lastRenderedPageBreak/>
         <w:t>Angular Login Screen</w:t>
       </w:r>
     </w:p>
@@ -5898,6 +5899,7 @@
     <w:p/>
     <w:p>
       <w:r>
+        <w:lastRenderedPageBreak/>
         <w:t xml:space="preserve">            }</w:t>
       </w:r>
     </w:p>
@@ -5910,31 +5912,79 @@
     <w:p/>
     <w:p>
       <w:r>
+        <w:t xml:space="preserve">        stage('Docker Build') {</w:t>
+      </w:r>
+    </w:p>
+    <w:p/>
+    <w:p>
+      <w:r>
+        <w:t xml:space="preserve">            steps {</w:t>
+      </w:r>
+    </w:p>
+    <w:p/>
+    <w:p>
+      <w:r>
+        <w:t xml:space="preserve">                bat 'docker build -t learning-track-ui .'</w:t>
+      </w:r>
+    </w:p>
+    <w:p/>
+    <w:p>
+      <w:r>
+        <w:t xml:space="preserve">            }</w:t>
+      </w:r>
+    </w:p>
+    <w:p/>
+    <w:p>
+      <w:r>
+        <w:t xml:space="preserve">        }</w:t>
+      </w:r>
+    </w:p>
+    <w:p/>
+    <w:p>
+      <w:r>
+        <w:t xml:space="preserve">    }</w:t>
+      </w:r>
+    </w:p>
+    <w:p/>
+    <w:p>
+      <w:r>
+        <w:t xml:space="preserve">    post {</w:t>
+      </w:r>
+    </w:p>
+    <w:p/>
+    <w:p>
+      <w:r>
+        <w:t xml:space="preserve">        success {</w:t>
+      </w:r>
+    </w:p>
+    <w:p/>
+    <w:p>
+      <w:r>
+        <w:t xml:space="preserve">            echo 'Angular Build Successful'</w:t>
+      </w:r>
+    </w:p>
+    <w:p/>
+    <w:p>
+      <w:r>
+        <w:t xml:space="preserve">        }</w:t>
+      </w:r>
+    </w:p>
+    <w:p/>
+    <w:p>
+      <w:r>
+        <w:t xml:space="preserve">        failure {</w:t>
+      </w:r>
+    </w:p>
+    <w:p/>
+    <w:p>
+      <w:r>
+        <w:t xml:space="preserve">            echo 'Angular Build Failed'</w:t>
+      </w:r>
+    </w:p>
+    <w:p/>
+    <w:p>
+      <w:r>
         <w:lastRenderedPageBreak/>
-        <w:t xml:space="preserve">        stage('Docker Build') {</w:t>
-      </w:r>
-    </w:p>
-    <w:p/>
-    <w:p>
-      <w:r>
-        <w:t xml:space="preserve">            steps {</w:t>
-      </w:r>
-    </w:p>
-    <w:p/>
-    <w:p>
-      <w:r>
-        <w:t xml:space="preserve">                bat 'docker build -t learning-track-ui .'</w:t>
-      </w:r>
-    </w:p>
-    <w:p/>
-    <w:p>
-      <w:r>
-        <w:t xml:space="preserve">            }</w:t>
-      </w:r>
-    </w:p>
-    <w:p/>
-    <w:p>
-      <w:r>
         <w:t xml:space="preserve">        }</w:t>
       </w:r>
     </w:p>
@@ -5947,55 +5997,6 @@
     <w:p/>
     <w:p>
       <w:r>
-        <w:t xml:space="preserve">    post {</w:t>
-      </w:r>
-    </w:p>
-    <w:p/>
-    <w:p>
-      <w:r>
-        <w:t xml:space="preserve">        success {</w:t>
-      </w:r>
-    </w:p>
-    <w:p/>
-    <w:p>
-      <w:r>
-        <w:t xml:space="preserve">            echo 'Angular Build Successful'</w:t>
-      </w:r>
-    </w:p>
-    <w:p/>
-    <w:p>
-      <w:r>
-        <w:t xml:space="preserve">        }</w:t>
-      </w:r>
-    </w:p>
-    <w:p/>
-    <w:p>
-      <w:r>
-        <w:t xml:space="preserve">        failure {</w:t>
-      </w:r>
-    </w:p>
-    <w:p/>
-    <w:p>
-      <w:r>
-        <w:t xml:space="preserve">            echo 'Angular Build Failed'</w:t>
-      </w:r>
-    </w:p>
-    <w:p/>
-    <w:p>
-      <w:r>
-        <w:t xml:space="preserve">        }</w:t>
-      </w:r>
-    </w:p>
-    <w:p/>
-    <w:p>
-      <w:r>
-        <w:t xml:space="preserve">    }</w:t>
-      </w:r>
-    </w:p>
-    <w:p/>
-    <w:p>
-      <w:r>
-        <w:lastRenderedPageBreak/>
         <w:t>}</w:t>
       </w:r>
     </w:p>

</xml_diff>